<commit_message>
Update Lyapunov Contraction Recursion Unrolling.docx
</commit_message>
<xml_diff>
--- a/Lyapunov Contraction Recursion Unrolling.docx
+++ b/Lyapunov Contraction Recursion Unrolling.docx
@@ -3414,13 +3414,7 @@
             <w:rPr>
               <w:rFonts w:ascii="Cambria Math" w:eastAsia="Cambria Math" w:hAnsi="Cambria Math"/>
             </w:rPr>
-            <m:t>=</m:t>
-          </m:r>
-          <m:r>
-            <w:rPr>
-              <w:rFonts w:ascii="Cambria Math" w:eastAsia="Cambria Math" w:hAnsi="Cambria Math"/>
-            </w:rPr>
-            <m:t>2</m:t>
+            <m:t>=2</m:t>
           </m:r>
           <m:sSub>
             <m:sSubPr>
@@ -4986,15 +4980,7 @@
                                     <w:sz w:val="28"/>
                                     <w:szCs w:val="28"/>
                                   </w:rPr>
-                                  <m:t>k</m:t>
-                                </m:r>
-                                <m:r>
-                                  <w:rPr>
-                                    <w:rFonts w:ascii="Cambria Math" w:hAnsi="Cambria Math"/>
-                                    <w:sz w:val="28"/>
-                                    <w:szCs w:val="28"/>
-                                  </w:rPr>
-                                  <m:t>,i</m:t>
+                                  <m:t>k,i</m:t>
                                 </m:r>
                               </m:sub>
                             </m:sSub>
@@ -5168,15 +5154,7 @@
                                     <w:sz w:val="28"/>
                                     <w:szCs w:val="28"/>
                                   </w:rPr>
-                                  <m:t>n</m:t>
-                                </m:r>
-                                <m:r>
-                                  <w:rPr>
-                                    <w:rFonts w:ascii="Cambria Math" w:hAnsi="Cambria Math"/>
-                                    <w:sz w:val="28"/>
-                                    <w:szCs w:val="28"/>
-                                  </w:rPr>
-                                  <m:t>,i</m:t>
+                                  <m:t>n,i</m:t>
                                 </m:r>
                               </m:sub>
                             </m:sSub>
@@ -8989,57 +8967,6 @@
     </w:p>
     <w:p>
       <w:pPr>
-        <w:pStyle w:val="BodyText"/>
-      </w:pPr>
-      <w:r>
-        <w:t>B</w:t>
-      </w:r>
-      <w:r>
-        <w:t xml:space="preserve">ased on the errors from Section 6, </w:t>
-      </w:r>
-      <m:oMath>
-        <m:r>
-          <w:rPr>
-            <w:rFonts w:ascii="Cambria Math" w:hAnsi="Cambria Math"/>
-          </w:rPr>
-          <m:t>κ=</m:t>
-        </m:r>
-        <m:sSub>
-          <m:sSubPr>
-            <m:ctrlPr>
-              <w:rPr>
-                <w:rFonts w:ascii="Cambria Math" w:hAnsi="Cambria Math"/>
-                <w:i/>
-              </w:rPr>
-            </m:ctrlPr>
-          </m:sSubPr>
-          <m:e>
-            <m:r>
-              <w:rPr>
-                <w:rFonts w:ascii="Cambria Math" w:hAnsi="Cambria Math"/>
-              </w:rPr>
-              <m:t>m</m:t>
-            </m:r>
-          </m:e>
-          <m:sub>
-            <m:r>
-              <w:rPr>
-                <w:rFonts w:ascii="Cambria Math" w:hAnsi="Cambria Math"/>
-              </w:rPr>
-              <m:t>k</m:t>
-            </m:r>
-          </m:sub>
-        </m:sSub>
-      </m:oMath>
-      <w:r>
-        <w:rPr>
-          <w:rFonts w:eastAsiaTheme="minorEastAsia"/>
-        </w:rPr>
-        <w:t>:</w:t>
-      </w:r>
-    </w:p>
-    <w:p>
-      <w:pPr>
         <w:jc w:val="center"/>
         <w:rPr>
           <w:rFonts w:eastAsiaTheme="minorEastAsia"/>
@@ -9054,6 +8981,8 @@
               <m:ctrlPr>
                 <w:rPr>
                   <w:rFonts w:ascii="Cambria Math" w:eastAsiaTheme="minorEastAsia" w:hAnsi="Cambria Math"/>
+                  <w:sz w:val="24"/>
+                  <w:szCs w:val="24"/>
                 </w:rPr>
               </m:ctrlPr>
             </m:fPr>
@@ -9093,6 +9022,8 @@
                       <m:r>
                         <w:rPr>
                           <w:rFonts w:ascii="Cambria Math" w:eastAsia="Cambria Math" w:hAnsi="Cambria Math"/>
+                          <w:sz w:val="24"/>
+                          <w:szCs w:val="24"/>
                         </w:rPr>
                         <m:t>ζ</m:t>
                       </m:r>
@@ -9101,6 +9032,8 @@
                       <m:r>
                         <w:rPr>
                           <w:rFonts w:ascii="Cambria Math" w:hAnsi="Cambria Math"/>
+                          <w:sz w:val="24"/>
+                          <w:szCs w:val="24"/>
                         </w:rPr>
                         <m:t>k</m:t>
                       </m:r>
@@ -9113,6 +9046,8 @@
               <m:r>
                 <w:rPr>
                   <w:rFonts w:ascii="Cambria Math" w:eastAsiaTheme="minorEastAsia" w:hAnsi="Cambria Math"/>
+                  <w:sz w:val="24"/>
+                  <w:szCs w:val="24"/>
                   <w:highlight w:val="yellow"/>
                 </w:rPr>
                 <m:t>1-</m:t>
@@ -9125,6 +9060,8 @@
                     <w:rPr>
                       <w:rFonts w:ascii="Cambria Math" w:eastAsiaTheme="minorEastAsia" w:hAnsi="Cambria Math"/>
                       <w:i/>
+                      <w:sz w:val="24"/>
+                      <w:szCs w:val="24"/>
                       <w:highlight w:val="yellow"/>
                     </w:rPr>
                   </m:ctrlPr>
@@ -9133,6 +9070,8 @@
                   <m:r>
                     <w:rPr>
                       <w:rFonts w:ascii="Cambria Math" w:eastAsiaTheme="minorEastAsia" w:hAnsi="Cambria Math"/>
+                      <w:sz w:val="24"/>
+                      <w:szCs w:val="24"/>
                       <w:highlight w:val="yellow"/>
                     </w:rPr>
                     <m:t>q</m:t>
@@ -9147,6 +9086,8 @@
             </m:rPr>
             <w:rPr>
               <w:rFonts w:ascii="Cambria Math" w:eastAsiaTheme="minorEastAsia" w:hAnsi="Cambria Math"/>
+              <w:sz w:val="24"/>
+              <w:szCs w:val="24"/>
               <w:highlight w:val="yellow"/>
             </w:rPr>
             <m:t>≤</m:t>
@@ -9177,6 +9118,84 @@
                   </m:ctrlPr>
                 </m:eqArrPr>
                 <m:e>
+                  <m:f>
+                    <m:fPr>
+                      <m:ctrlPr>
+                        <w:rPr>
+                          <w:rFonts w:ascii="Cambria Math" w:hAnsi="Cambria Math"/>
+                          <w:i/>
+                          <w:sz w:val="24"/>
+                          <w:szCs w:val="24"/>
+                        </w:rPr>
+                      </m:ctrlPr>
+                    </m:fPr>
+                    <m:num>
+                      <m:r>
+                        <w:rPr>
+                          <w:rFonts w:ascii="Cambria Math" w:hAnsi="Cambria Math"/>
+                          <w:sz w:val="24"/>
+                          <w:szCs w:val="24"/>
+                        </w:rPr>
+                        <m:t>κ</m:t>
+                      </m:r>
+                    </m:num>
+                    <m:den>
+                      <m:d>
+                        <m:dPr>
+                          <m:begChr m:val="|"/>
+                          <m:endChr m:val="|"/>
+                          <m:ctrlPr>
+                            <w:rPr>
+                              <w:rFonts w:ascii="Cambria Math" w:eastAsia="Times New Roman" w:hAnsi="Cambria Math" w:cs="Times New Roman"/>
+                              <w:i/>
+                              <w:kern w:val="0"/>
+                              <w:sz w:val="24"/>
+                              <w:szCs w:val="24"/>
+                              <w:lang w:val="en-US"/>
+                              <w14:ligatures w14:val="none"/>
+                            </w:rPr>
+                          </m:ctrlPr>
+                        </m:dPr>
+                        <m:e>
+                          <m:sSub>
+                            <m:sSubPr>
+                              <m:ctrlPr>
+                                <w:rPr>
+                                  <w:rFonts w:ascii="Cambria Math" w:eastAsia="Times New Roman" w:hAnsi="Cambria Math" w:cs="Times New Roman"/>
+                                  <w:i/>
+                                  <w:kern w:val="0"/>
+                                  <w:sz w:val="24"/>
+                                  <w:szCs w:val="24"/>
+                                  <w:lang w:val="en-US"/>
+                                  <w14:ligatures w14:val="none"/>
+                                </w:rPr>
+                              </m:ctrlPr>
+                            </m:sSubPr>
+                            <m:e>
+                              <m:r>
+                                <w:rPr>
+                                  <w:rFonts w:ascii="Cambria Math" w:hAnsi="Cambria Math"/>
+                                  <w:sz w:val="24"/>
+                                  <w:szCs w:val="24"/>
+                                </w:rPr>
+                                <m:t>m</m:t>
+                              </m:r>
+                            </m:e>
+                            <m:sub>
+                              <m:r>
+                                <w:rPr>
+                                  <w:rFonts w:ascii="Cambria Math" w:hAnsi="Cambria Math"/>
+                                  <w:sz w:val="24"/>
+                                  <w:szCs w:val="24"/>
+                                </w:rPr>
+                                <m:t>k</m:t>
+                              </m:r>
+                            </m:sub>
+                          </m:sSub>
+                        </m:e>
+                      </m:d>
+                    </m:den>
+                  </m:f>
                   <m:m>
                     <m:mPr>
                       <m:mcs>
@@ -9204,6 +9223,8 @@
                               <w:rPr>
                                 <w:rFonts w:ascii="Cambria Math" w:hAnsi="Cambria Math"/>
                                 <w:i/>
+                                <w:sz w:val="24"/>
+                                <w:szCs w:val="24"/>
                               </w:rPr>
                             </m:ctrlPr>
                           </m:fPr>
@@ -9211,6 +9232,8 @@
                             <m:r>
                               <w:rPr>
                                 <w:rFonts w:ascii="Cambria Math" w:hAnsi="Cambria Math"/>
+                                <w:sz w:val="24"/>
+                                <w:szCs w:val="24"/>
                               </w:rPr>
                               <m:t>2s</m:t>
                             </m:r>
@@ -9220,6 +9243,8 @@
                                   <w:rPr>
                                     <w:rFonts w:ascii="Cambria Math" w:hAnsi="Cambria Math"/>
                                     <w:i/>
+                                    <w:sz w:val="24"/>
+                                    <w:szCs w:val="24"/>
                                   </w:rPr>
                                 </m:ctrlPr>
                               </m:dPr>
@@ -9227,6 +9252,8 @@
                                 <m:r>
                                   <w:rPr>
                                     <w:rFonts w:ascii="Cambria Math" w:hAnsi="Cambria Math"/>
+                                    <w:sz w:val="24"/>
+                                    <w:szCs w:val="24"/>
                                   </w:rPr>
                                   <m:t>α</m:t>
                                 </m:r>
@@ -9240,6 +9267,8 @@
                                 <m:ctrlPr>
                                   <w:rPr>
                                     <w:rFonts w:ascii="Cambria Math" w:hAnsi="Cambria Math"/>
+                                    <w:sz w:val="24"/>
+                                    <w:szCs w:val="24"/>
                                   </w:rPr>
                                 </m:ctrlPr>
                               </m:radPr>
@@ -9248,6 +9277,8 @@
                                 <m:r>
                                   <w:rPr>
                                     <w:rFonts w:ascii="Cambria Math" w:hAnsi="Cambria Math"/>
+                                    <w:sz w:val="24"/>
+                                    <w:szCs w:val="24"/>
                                   </w:rPr>
                                   <m:t>n</m:t>
                                 </m:r>
@@ -9318,6 +9349,84 @@
                     </m:mPr>
                     <m:mr>
                       <m:e>
+                        <m:f>
+                          <m:fPr>
+                            <m:ctrlPr>
+                              <w:rPr>
+                                <w:rFonts w:ascii="Cambria Math" w:hAnsi="Cambria Math"/>
+                                <w:i/>
+                                <w:sz w:val="24"/>
+                                <w:szCs w:val="24"/>
+                              </w:rPr>
+                            </m:ctrlPr>
+                          </m:fPr>
+                          <m:num>
+                            <m:r>
+                              <w:rPr>
+                                <w:rFonts w:ascii="Cambria Math" w:hAnsi="Cambria Math"/>
+                                <w:sz w:val="24"/>
+                                <w:szCs w:val="24"/>
+                              </w:rPr>
+                              <m:t>κ</m:t>
+                            </m:r>
+                          </m:num>
+                          <m:den>
+                            <m:d>
+                              <m:dPr>
+                                <m:begChr m:val="|"/>
+                                <m:endChr m:val="|"/>
+                                <m:ctrlPr>
+                                  <w:rPr>
+                                    <w:rFonts w:ascii="Cambria Math" w:eastAsia="Times New Roman" w:hAnsi="Cambria Math" w:cs="Times New Roman"/>
+                                    <w:i/>
+                                    <w:kern w:val="0"/>
+                                    <w:sz w:val="24"/>
+                                    <w:szCs w:val="24"/>
+                                    <w:lang w:val="en-US"/>
+                                    <w14:ligatures w14:val="none"/>
+                                  </w:rPr>
+                                </m:ctrlPr>
+                              </m:dPr>
+                              <m:e>
+                                <m:sSub>
+                                  <m:sSubPr>
+                                    <m:ctrlPr>
+                                      <w:rPr>
+                                        <w:rFonts w:ascii="Cambria Math" w:eastAsia="Times New Roman" w:hAnsi="Cambria Math" w:cs="Times New Roman"/>
+                                        <w:i/>
+                                        <w:kern w:val="0"/>
+                                        <w:sz w:val="24"/>
+                                        <w:szCs w:val="24"/>
+                                        <w:lang w:val="en-US"/>
+                                        <w14:ligatures w14:val="none"/>
+                                      </w:rPr>
+                                    </m:ctrlPr>
+                                  </m:sSubPr>
+                                  <m:e>
+                                    <m:r>
+                                      <w:rPr>
+                                        <w:rFonts w:ascii="Cambria Math" w:hAnsi="Cambria Math"/>
+                                        <w:sz w:val="24"/>
+                                        <w:szCs w:val="24"/>
+                                      </w:rPr>
+                                      <m:t>m</m:t>
+                                    </m:r>
+                                  </m:e>
+                                  <m:sub>
+                                    <m:r>
+                                      <w:rPr>
+                                        <w:rFonts w:ascii="Cambria Math" w:hAnsi="Cambria Math"/>
+                                        <w:sz w:val="24"/>
+                                        <w:szCs w:val="24"/>
+                                      </w:rPr>
+                                      <m:t>k</m:t>
+                                    </m:r>
+                                  </m:sub>
+                                </m:sSub>
+                              </m:e>
+                            </m:d>
+                          </m:den>
+                        </m:f>
                         <m:f>
                           <m:fPr>
                             <m:ctrlPr>
@@ -9407,6 +9516,8 @@
                               <w:rPr>
                                 <w:rFonts w:ascii="Cambria Math" w:hAnsi="Cambria Math"/>
                                 <w:i/>
+                                <w:sz w:val="24"/>
+                                <w:szCs w:val="24"/>
                               </w:rPr>
                             </m:ctrlPr>
                           </m:fPr>
@@ -9414,6 +9525,8 @@
                             <m:r>
                               <w:rPr>
                                 <w:rFonts w:ascii="Cambria Math" w:hAnsi="Cambria Math"/>
+                                <w:sz w:val="24"/>
+                                <w:szCs w:val="24"/>
                               </w:rPr>
                               <m:t>2s</m:t>
                             </m:r>
@@ -9423,6 +9536,8 @@
                                   <w:rPr>
                                     <w:rFonts w:ascii="Cambria Math" w:hAnsi="Cambria Math"/>
                                     <w:i/>
+                                    <w:sz w:val="24"/>
+                                    <w:szCs w:val="24"/>
                                   </w:rPr>
                                 </m:ctrlPr>
                               </m:dPr>
@@ -9430,6 +9545,8 @@
                                 <m:r>
                                   <w:rPr>
                                     <w:rFonts w:ascii="Cambria Math" w:hAnsi="Cambria Math"/>
+                                    <w:sz w:val="24"/>
+                                    <w:szCs w:val="24"/>
                                   </w:rPr>
                                   <m:t>α</m:t>
                                 </m:r>
@@ -9443,6 +9560,8 @@
                                 <m:ctrlPr>
                                   <w:rPr>
                                     <w:rFonts w:ascii="Cambria Math" w:hAnsi="Cambria Math"/>
+                                    <w:sz w:val="24"/>
+                                    <w:szCs w:val="24"/>
                                   </w:rPr>
                                 </m:ctrlPr>
                               </m:radPr>
@@ -9451,6 +9570,8 @@
                                 <m:r>
                                   <w:rPr>
                                     <w:rFonts w:ascii="Cambria Math" w:hAnsi="Cambria Math"/>
+                                    <w:sz w:val="24"/>
+                                    <w:szCs w:val="24"/>
                                   </w:rPr>
                                   <m:t>n</m:t>
                                 </m:r>
@@ -9818,66 +9939,22 @@
                     </m:mPr>
                     <m:mr>
                       <m:e>
-                        <m:d>
-                          <m:dPr>
-                            <m:begChr m:val="|"/>
-                            <m:endChr m:val="|"/>
-                            <m:ctrlPr>
-                              <w:rPr>
-                                <w:rFonts w:ascii="Cambria Math" w:eastAsia="Times New Roman" w:hAnsi="Cambria Math" w:cs="Times New Roman"/>
-                                <w:i/>
-                                <w:kern w:val="0"/>
-                                <w:sz w:val="24"/>
-                                <w:szCs w:val="24"/>
-                                <w:lang w:val="en-US"/>
-                                <w14:ligatures w14:val="none"/>
-                              </w:rPr>
-                            </m:ctrlPr>
-                          </m:dPr>
-                          <m:e>
-                            <m:sSub>
-                              <m:sSubPr>
-                                <m:ctrlPr>
-                                  <w:rPr>
-                                    <w:rFonts w:ascii="Cambria Math" w:eastAsia="Times New Roman" w:hAnsi="Cambria Math" w:cs="Times New Roman"/>
-                                    <w:i/>
-                                    <w:kern w:val="0"/>
-                                    <w:sz w:val="24"/>
-                                    <w:szCs w:val="24"/>
-                                    <w:lang w:val="en-US"/>
-                                    <w14:ligatures w14:val="none"/>
-                                  </w:rPr>
-                                </m:ctrlPr>
-                              </m:sSubPr>
-                              <m:e>
-                                <m:r>
-                                  <w:rPr>
-                                    <w:rFonts w:ascii="Cambria Math" w:hAnsi="Cambria Math"/>
-                                    <w:sz w:val="24"/>
-                                    <w:szCs w:val="24"/>
-                                  </w:rPr>
-                                  <m:t>m</m:t>
-                                </m:r>
-                              </m:e>
-                              <m:sub>
-                                <m:r>
-                                  <w:rPr>
-                                    <w:rFonts w:ascii="Cambria Math" w:hAnsi="Cambria Math"/>
-                                    <w:sz w:val="24"/>
-                                    <w:szCs w:val="24"/>
-                                  </w:rPr>
-                                  <m:t>k</m:t>
-                                </m:r>
-                              </m:sub>
-                            </m:sSub>
-                          </m:e>
-                        </m:d>
+                        <m:r>
+                          <w:rPr>
+                            <w:rFonts w:ascii="Cambria Math" w:hAnsi="Cambria Math"/>
+                            <w:sz w:val="24"/>
+                            <w:szCs w:val="24"/>
+                          </w:rPr>
+                          <m:t>κ</m:t>
+                        </m:r>
                         <m:f>
                           <m:fPr>
                             <m:ctrlPr>
                               <w:rPr>
                                 <w:rFonts w:ascii="Cambria Math" w:hAnsi="Cambria Math"/>
                                 <w:i/>
+                                <w:sz w:val="24"/>
+                                <w:szCs w:val="24"/>
                               </w:rPr>
                             </m:ctrlPr>
                           </m:fPr>
@@ -9885,6 +9962,8 @@
                             <m:r>
                               <w:rPr>
                                 <w:rFonts w:ascii="Cambria Math" w:hAnsi="Cambria Math"/>
+                                <w:sz w:val="24"/>
+                                <w:szCs w:val="24"/>
                               </w:rPr>
                               <m:t>2s</m:t>
                             </m:r>
@@ -9894,6 +9973,8 @@
                                   <w:rPr>
                                     <w:rFonts w:ascii="Cambria Math" w:hAnsi="Cambria Math"/>
                                     <w:i/>
+                                    <w:sz w:val="24"/>
+                                    <w:szCs w:val="24"/>
                                   </w:rPr>
                                 </m:ctrlPr>
                               </m:dPr>
@@ -9901,6 +9982,8 @@
                                 <m:r>
                                   <w:rPr>
                                     <w:rFonts w:ascii="Cambria Math" w:hAnsi="Cambria Math"/>
+                                    <w:sz w:val="24"/>
+                                    <w:szCs w:val="24"/>
                                   </w:rPr>
                                   <m:t>α</m:t>
                                 </m:r>
@@ -9914,6 +9997,8 @@
                                 <m:ctrlPr>
                                   <w:rPr>
                                     <w:rFonts w:ascii="Cambria Math" w:hAnsi="Cambria Math"/>
+                                    <w:sz w:val="24"/>
+                                    <w:szCs w:val="24"/>
                                   </w:rPr>
                                 </m:ctrlPr>
                               </m:radPr>
@@ -9922,6 +10007,8 @@
                                 <m:r>
                                   <w:rPr>
                                     <w:rFonts w:ascii="Cambria Math" w:hAnsi="Cambria Math"/>
+                                    <w:sz w:val="24"/>
+                                    <w:szCs w:val="24"/>
                                   </w:rPr>
                                   <m:t>n</m:t>
                                 </m:r>
@@ -10125,60 +10212,14 @@
                     </m:mPr>
                     <m:mr>
                       <m:e>
-                        <m:d>
-                          <m:dPr>
-                            <m:begChr m:val="|"/>
-                            <m:endChr m:val="|"/>
-                            <m:ctrlPr>
-                              <w:rPr>
-                                <w:rFonts w:ascii="Cambria Math" w:eastAsia="Times New Roman" w:hAnsi="Cambria Math" w:cs="Times New Roman"/>
-                                <w:i/>
-                                <w:kern w:val="0"/>
-                                <w:sz w:val="24"/>
-                                <w:szCs w:val="24"/>
-                                <w:lang w:val="en-US"/>
-                                <w14:ligatures w14:val="none"/>
-                              </w:rPr>
-                            </m:ctrlPr>
-                          </m:dPr>
-                          <m:e>
-                            <m:sSub>
-                              <m:sSubPr>
-                                <m:ctrlPr>
-                                  <w:rPr>
-                                    <w:rFonts w:ascii="Cambria Math" w:eastAsia="Times New Roman" w:hAnsi="Cambria Math" w:cs="Times New Roman"/>
-                                    <w:i/>
-                                    <w:kern w:val="0"/>
-                                    <w:sz w:val="24"/>
-                                    <w:szCs w:val="24"/>
-                                    <w:lang w:val="en-US"/>
-                                    <w14:ligatures w14:val="none"/>
-                                  </w:rPr>
-                                </m:ctrlPr>
-                              </m:sSubPr>
-                              <m:e>
-                                <m:r>
-                                  <w:rPr>
-                                    <w:rFonts w:ascii="Cambria Math" w:hAnsi="Cambria Math"/>
-                                    <w:sz w:val="24"/>
-                                    <w:szCs w:val="24"/>
-                                  </w:rPr>
-                                  <m:t>m</m:t>
-                                </m:r>
-                              </m:e>
-                              <m:sub>
-                                <m:r>
-                                  <w:rPr>
-                                    <w:rFonts w:ascii="Cambria Math" w:hAnsi="Cambria Math"/>
-                                    <w:sz w:val="24"/>
-                                    <w:szCs w:val="24"/>
-                                  </w:rPr>
-                                  <m:t>k</m:t>
-                                </m:r>
-                              </m:sub>
-                            </m:sSub>
-                          </m:e>
-                        </m:d>
+                        <m:r>
+                          <w:rPr>
+                            <w:rFonts w:ascii="Cambria Math" w:hAnsi="Cambria Math"/>
+                            <w:sz w:val="24"/>
+                            <w:szCs w:val="24"/>
+                          </w:rPr>
+                          <m:t>κ</m:t>
+                        </m:r>
                         <m:f>
                           <m:fPr>
                             <m:ctrlPr>
@@ -10260,6 +10301,8 @@
                               <w:rPr>
                                 <w:rFonts w:ascii="Cambria Math" w:hAnsi="Cambria Math"/>
                                 <w:i/>
+                                <w:sz w:val="24"/>
+                                <w:szCs w:val="24"/>
                               </w:rPr>
                             </m:ctrlPr>
                           </m:fPr>
@@ -10267,6 +10310,8 @@
                             <m:r>
                               <w:rPr>
                                 <w:rFonts w:ascii="Cambria Math" w:hAnsi="Cambria Math"/>
+                                <w:sz w:val="24"/>
+                                <w:szCs w:val="24"/>
                               </w:rPr>
                               <m:t>2s</m:t>
                             </m:r>
@@ -10276,6 +10321,8 @@
                                   <w:rPr>
                                     <w:rFonts w:ascii="Cambria Math" w:hAnsi="Cambria Math"/>
                                     <w:i/>
+                                    <w:sz w:val="24"/>
+                                    <w:szCs w:val="24"/>
                                   </w:rPr>
                                 </m:ctrlPr>
                               </m:dPr>
@@ -10283,6 +10330,8 @@
                                 <m:r>
                                   <w:rPr>
                                     <w:rFonts w:ascii="Cambria Math" w:hAnsi="Cambria Math"/>
+                                    <w:sz w:val="24"/>
+                                    <w:szCs w:val="24"/>
                                   </w:rPr>
                                   <m:t>α</m:t>
                                 </m:r>
@@ -10296,6 +10345,8 @@
                                 <m:ctrlPr>
                                   <w:rPr>
                                     <w:rFonts w:ascii="Cambria Math" w:hAnsi="Cambria Math"/>
+                                    <w:sz w:val="24"/>
+                                    <w:szCs w:val="24"/>
                                   </w:rPr>
                                 </m:ctrlPr>
                               </m:radPr>
@@ -10304,6 +10355,8 @@
                                 <m:r>
                                   <w:rPr>
                                     <w:rFonts w:ascii="Cambria Math" w:hAnsi="Cambria Math"/>
+                                    <w:sz w:val="24"/>
+                                    <w:szCs w:val="24"/>
                                   </w:rPr>
                                   <m:t>n</m:t>
                                 </m:r>
@@ -10493,27 +10546,16 @@
     </w:p>
     <w:p>
       <w:pPr>
+        <w:pStyle w:val="BodyText"/>
         <w:rPr>
           <w:rFonts w:eastAsiaTheme="minorEastAsia"/>
-          <w:sz w:val="24"/>
-          <w:szCs w:val="24"/>
         </w:rPr>
       </w:pPr>
       <w:r>
         <w:rPr>
           <w:rFonts w:eastAsiaTheme="minorEastAsia"/>
-          <w:sz w:val="24"/>
-          <w:szCs w:val="24"/>
         </w:rPr>
-        <w:t>Following the bounds</w:t>
-      </w:r>
-      <w:r>
-        <w:rPr>
-          <w:rFonts w:eastAsiaTheme="minorEastAsia"/>
-          <w:sz w:val="24"/>
-          <w:szCs w:val="24"/>
-        </w:rPr>
-        <w:t xml:space="preserve"> for </w:t>
+        <w:t xml:space="preserve">Following the bounds for </w:t>
       </w:r>
       <m:oMath>
         <m:d>
@@ -10524,8 +10566,6 @@
               <w:rPr>
                 <w:rFonts w:ascii="Cambria Math" w:hAnsi="Cambria Math"/>
                 <w:i/>
-                <w:sz w:val="24"/>
-                <w:szCs w:val="24"/>
               </w:rPr>
             </m:ctrlPr>
           </m:dPr>
@@ -10533,8 +10573,6 @@
             <m:r>
               <w:rPr>
                 <w:rFonts w:ascii="Cambria Math" w:hAnsi="Cambria Math"/>
-                <w:sz w:val="24"/>
-                <w:szCs w:val="24"/>
               </w:rPr>
               <m:t>μ</m:t>
             </m:r>
@@ -10544,8 +10582,6 @@
                   <w:rPr>
                     <w:rFonts w:ascii="Cambria Math" w:hAnsi="Cambria Math"/>
                     <w:i/>
-                    <w:sz w:val="24"/>
-                    <w:szCs w:val="24"/>
                   </w:rPr>
                 </m:ctrlPr>
               </m:dPr>
@@ -10556,8 +10592,6 @@
                       <w:rPr>
                         <w:rFonts w:ascii="Cambria Math" w:hAnsi="Cambria Math"/>
                         <w:i/>
-                        <w:sz w:val="24"/>
-                        <w:szCs w:val="24"/>
                       </w:rPr>
                     </m:ctrlPr>
                   </m:sSubPr>
@@ -10565,8 +10599,6 @@
                     <m:r>
                       <w:rPr>
                         <w:rFonts w:ascii="Cambria Math" w:hAnsi="Cambria Math"/>
-                        <w:sz w:val="24"/>
-                        <w:szCs w:val="24"/>
                       </w:rPr>
                       <m:t>α</m:t>
                     </m:r>
@@ -10575,8 +10607,6 @@
                     <m:r>
                       <w:rPr>
                         <w:rFonts w:ascii="Cambria Math" w:hAnsi="Cambria Math"/>
-                        <w:sz w:val="24"/>
-                        <w:szCs w:val="24"/>
                       </w:rPr>
                       <m:t>k</m:t>
                     </m:r>
@@ -10587,8 +10617,6 @@
             <m:r>
               <w:rPr>
                 <w:rFonts w:ascii="Cambria Math" w:hAnsi="Cambria Math"/>
-                <w:sz w:val="24"/>
-                <w:szCs w:val="24"/>
               </w:rPr>
               <m:t>-</m:t>
             </m:r>
@@ -10598,8 +10626,6 @@
                   <w:rPr>
                     <w:rFonts w:ascii="Cambria Math" w:hAnsi="Cambria Math"/>
                     <w:i/>
-                    <w:sz w:val="24"/>
-                    <w:szCs w:val="24"/>
                   </w:rPr>
                 </m:ctrlPr>
               </m:sSubPr>
@@ -10607,8 +10633,6 @@
                 <m:r>
                   <w:rPr>
                     <w:rFonts w:ascii="Cambria Math" w:hAnsi="Cambria Math"/>
-                    <w:sz w:val="24"/>
-                    <w:szCs w:val="24"/>
                   </w:rPr>
                   <m:t>v</m:t>
                 </m:r>
@@ -10617,8 +10641,6 @@
                 <m:r>
                   <w:rPr>
                     <w:rFonts w:ascii="Cambria Math" w:hAnsi="Cambria Math"/>
-                    <w:sz w:val="24"/>
-                    <w:szCs w:val="24"/>
                   </w:rPr>
                   <m:t>d</m:t>
                 </m:r>
@@ -10629,8 +10651,6 @@
         <m:r>
           <w:rPr>
             <w:rFonts w:ascii="Cambria Math" w:hAnsi="Cambria Math"/>
-            <w:sz w:val="24"/>
-            <w:szCs w:val="24"/>
           </w:rPr>
           <m:t>≤C</m:t>
         </m:r>
@@ -10640,8 +10660,6 @@
               <w:rPr>
                 <w:rFonts w:ascii="Cambria Math" w:hAnsi="Cambria Math"/>
                 <w:i/>
-                <w:sz w:val="24"/>
-                <w:szCs w:val="24"/>
               </w:rPr>
             </m:ctrlPr>
           </m:dPr>
@@ -10652,8 +10670,6 @@
               </m:rPr>
               <w:rPr>
                 <w:rFonts w:ascii="Cambria Math" w:hAnsi="Cambria Math"/>
-                <w:sz w:val="24"/>
-                <w:szCs w:val="24"/>
               </w:rPr>
               <m:t>M</m:t>
             </m:r>
@@ -10720,6 +10736,1279 @@
       <w:r>
         <w:rPr>
           <w:rFonts w:eastAsiaTheme="minorEastAsia"/>
+        </w:rPr>
+        <w:t xml:space="preserve">, we know that if </w:t>
+      </w:r>
+      <m:oMath>
+        <m:d>
+          <m:dPr>
+            <m:begChr m:val="|"/>
+            <m:endChr m:val="|"/>
+            <m:ctrlPr>
+              <w:rPr>
+                <w:rFonts w:ascii="Cambria Math" w:hAnsi="Cambria Math"/>
+                <w:i/>
+                <w:highlight w:val="yellow"/>
+              </w:rPr>
+            </m:ctrlPr>
+          </m:dPr>
+          <m:e>
+            <m:sSub>
+              <m:sSubPr>
+                <m:ctrlPr>
+                  <w:rPr>
+                    <w:rFonts w:ascii="Cambria Math" w:eastAsiaTheme="minorHAnsi" w:hAnsi="Cambria Math" w:cstheme="minorBidi"/>
+                    <w:i/>
+                    <w:kern w:val="2"/>
+                    <w:highlight w:val="yellow"/>
+                    <w:lang w:val="en-CA"/>
+                    <w14:ligatures w14:val="standardContextual"/>
+                  </w:rPr>
+                </m:ctrlPr>
+              </m:sSubPr>
+              <m:e>
+                <m:r>
+                  <w:rPr>
+                    <w:rFonts w:ascii="Cambria Math" w:hAnsi="Cambria Math"/>
+                    <w:highlight w:val="yellow"/>
+                  </w:rPr>
+                  <m:t>Δm</m:t>
+                </m:r>
+              </m:e>
+              <m:sub>
+                <m:r>
+                  <w:rPr>
+                    <w:rFonts w:ascii="Cambria Math" w:hAnsi="Cambria Math"/>
+                    <w:highlight w:val="yellow"/>
+                  </w:rPr>
+                  <m:t>k</m:t>
+                </m:r>
+              </m:sub>
+            </m:sSub>
+          </m:e>
+        </m:d>
+        <m:r>
+          <w:rPr>
+            <w:rFonts w:ascii="Cambria Math" w:hAnsi="Cambria Math"/>
+            <w:highlight w:val="yellow"/>
+          </w:rPr>
+          <m:t>∙</m:t>
+        </m:r>
+        <m:d>
+          <m:dPr>
+            <m:begChr m:val="|"/>
+            <m:endChr m:val="|"/>
+            <m:ctrlPr>
+              <w:rPr>
+                <w:rFonts w:ascii="Cambria Math" w:hAnsi="Cambria Math"/>
+                <w:i/>
+                <w:highlight w:val="yellow"/>
+              </w:rPr>
+            </m:ctrlPr>
+          </m:dPr>
+          <m:e>
+            <m:sSub>
+              <m:sSubPr>
+                <m:ctrlPr>
+                  <w:rPr>
+                    <w:rFonts w:ascii="Cambria Math" w:hAnsi="Cambria Math"/>
+                    <w:i/>
+                    <w:highlight w:val="yellow"/>
+                  </w:rPr>
+                </m:ctrlPr>
+              </m:sSubPr>
+              <m:e>
+                <m:r>
+                  <w:rPr>
+                    <w:rFonts w:ascii="Cambria Math" w:hAnsi="Cambria Math"/>
+                    <w:highlight w:val="yellow"/>
+                  </w:rPr>
+                  <m:t>e</m:t>
+                </m:r>
+              </m:e>
+              <m:sub>
+                <m:r>
+                  <w:rPr>
+                    <w:rFonts w:ascii="Cambria Math" w:hAnsi="Cambria Math"/>
+                    <w:highlight w:val="yellow"/>
+                  </w:rPr>
+                  <m:t>k</m:t>
+                </m:r>
+              </m:sub>
+            </m:sSub>
+          </m:e>
+        </m:d>
+        <m:r>
+          <w:rPr>
+            <w:rFonts w:ascii="Cambria Math" w:hAnsi="Cambria Math"/>
+            <w:highlight w:val="yellow"/>
+          </w:rPr>
+          <m:t>+</m:t>
+        </m:r>
+        <m:d>
+          <m:dPr>
+            <m:begChr m:val="|"/>
+            <m:endChr m:val="|"/>
+            <m:ctrlPr>
+              <w:rPr>
+                <w:rFonts w:ascii="Cambria Math" w:hAnsi="Cambria Math"/>
+                <w:i/>
+                <w:highlight w:val="yellow"/>
+              </w:rPr>
+            </m:ctrlPr>
+          </m:dPr>
+          <m:e>
+            <m:sSub>
+              <m:sSubPr>
+                <m:ctrlPr>
+                  <w:rPr>
+                    <w:rFonts w:ascii="Cambria Math" w:hAnsi="Cambria Math"/>
+                    <w:i/>
+                    <w:highlight w:val="yellow"/>
+                  </w:rPr>
+                </m:ctrlPr>
+              </m:sSubPr>
+              <m:e>
+                <m:r>
+                  <w:rPr>
+                    <w:rFonts w:ascii="Cambria Math" w:hAnsi="Cambria Math"/>
+                    <w:highlight w:val="yellow"/>
+                  </w:rPr>
+                  <m:t>δ</m:t>
+                </m:r>
+              </m:e>
+              <m:sub>
+                <m:r>
+                  <w:rPr>
+                    <w:rFonts w:ascii="Cambria Math" w:hAnsi="Cambria Math"/>
+                    <w:highlight w:val="yellow"/>
+                  </w:rPr>
+                  <m:t>n,k</m:t>
+                </m:r>
+              </m:sub>
+            </m:sSub>
+          </m:e>
+        </m:d>
+        <m:r>
+          <w:rPr>
+            <w:rFonts w:ascii="Cambria Math" w:hAnsi="Cambria Math"/>
+            <w:highlight w:val="yellow"/>
+          </w:rPr>
+          <m:t>+</m:t>
+        </m:r>
+        <m:d>
+          <m:dPr>
+            <m:begChr m:val="|"/>
+            <m:endChr m:val="|"/>
+            <m:ctrlPr>
+              <w:rPr>
+                <w:rFonts w:ascii="Cambria Math" w:hAnsi="Cambria Math"/>
+                <w:i/>
+                <w:highlight w:val="yellow"/>
+              </w:rPr>
+            </m:ctrlPr>
+          </m:dPr>
+          <m:e>
+            <m:r>
+              <w:rPr>
+                <w:rFonts w:ascii="Cambria Math" w:hAnsi="Cambria Math"/>
+                <w:highlight w:val="yellow"/>
+              </w:rPr>
+              <m:t>∆</m:t>
+            </m:r>
+            <m:sSub>
+              <m:sSubPr>
+                <m:ctrlPr>
+                  <w:rPr>
+                    <w:rFonts w:ascii="Cambria Math" w:hAnsi="Cambria Math"/>
+                    <w:i/>
+                    <w:highlight w:val="yellow"/>
+                  </w:rPr>
+                </m:ctrlPr>
+              </m:sSubPr>
+              <m:e>
+                <m:r>
+                  <w:rPr>
+                    <w:rFonts w:ascii="Cambria Math" w:hAnsi="Cambria Math"/>
+                    <w:highlight w:val="yellow"/>
+                  </w:rPr>
+                  <m:t>Γ</m:t>
+                </m:r>
+              </m:e>
+              <m:sub>
+                <m:r>
+                  <w:rPr>
+                    <w:rFonts w:ascii="Cambria Math" w:hAnsi="Cambria Math"/>
+                    <w:highlight w:val="yellow"/>
+                  </w:rPr>
+                  <m:t>k</m:t>
+                </m:r>
+              </m:sub>
+            </m:sSub>
+          </m:e>
+        </m:d>
+        <m:r>
+          <w:rPr>
+            <w:rFonts w:ascii="Cambria Math" w:hAnsi="Cambria Math"/>
+            <w:highlight w:val="yellow"/>
+          </w:rPr>
+          <m:t>≤</m:t>
+        </m:r>
+        <m:r>
+          <w:rPr>
+            <w:rFonts w:ascii="Cambria Math" w:hAnsi="Cambria Math"/>
+          </w:rPr>
+          <m:t>κ</m:t>
+        </m:r>
+        <m:f>
+          <m:fPr>
+            <m:ctrlPr>
+              <w:rPr>
+                <w:rFonts w:ascii="Cambria Math" w:hAnsi="Cambria Math"/>
+                <w:i/>
+              </w:rPr>
+            </m:ctrlPr>
+          </m:fPr>
+          <m:num>
+            <m:r>
+              <w:rPr>
+                <w:rFonts w:ascii="Cambria Math" w:hAnsi="Cambria Math"/>
+              </w:rPr>
+              <m:t>2s</m:t>
+            </m:r>
+            <m:d>
+              <m:dPr>
+                <m:ctrlPr>
+                  <w:rPr>
+                    <w:rFonts w:ascii="Cambria Math" w:hAnsi="Cambria Math"/>
+                    <w:i/>
+                  </w:rPr>
+                </m:ctrlPr>
+              </m:dPr>
+              <m:e>
+                <m:r>
+                  <w:rPr>
+                    <w:rFonts w:ascii="Cambria Math" w:hAnsi="Cambria Math"/>
+                  </w:rPr>
+                  <m:t>α</m:t>
+                </m:r>
+              </m:e>
+            </m:d>
+          </m:num>
+          <m:den>
+            <m:rad>
+              <m:radPr>
+                <m:degHide m:val="1"/>
+                <m:ctrlPr>
+                  <w:rPr>
+                    <w:rFonts w:ascii="Cambria Math" w:hAnsi="Cambria Math"/>
+                  </w:rPr>
+                </m:ctrlPr>
+              </m:radPr>
+              <m:deg/>
+              <m:e>
+                <m:r>
+                  <w:rPr>
+                    <w:rFonts w:ascii="Cambria Math" w:hAnsi="Cambria Math"/>
+                  </w:rPr>
+                  <m:t>n</m:t>
+                </m:r>
+              </m:e>
+            </m:rad>
+          </m:den>
+        </m:f>
+      </m:oMath>
+      <w:r>
+        <w:rPr>
+          <w:rFonts w:eastAsiaTheme="minorEastAsia"/>
+        </w:rPr>
+        <w:t xml:space="preserve">, then </w:t>
+      </w:r>
+      <m:oMath>
+        <m:d>
+          <m:dPr>
+            <m:begChr m:val="|"/>
+            <m:endChr m:val="|"/>
+            <m:ctrlPr>
+              <w:rPr>
+                <w:rFonts w:ascii="Cambria Math" w:hAnsi="Cambria Math"/>
+                <w:i/>
+                <w:highlight w:val="yellow"/>
+              </w:rPr>
+            </m:ctrlPr>
+          </m:dPr>
+          <m:e>
+            <m:sSub>
+              <m:sSubPr>
+                <m:ctrlPr>
+                  <w:rPr>
+                    <w:rFonts w:ascii="Cambria Math" w:hAnsi="Cambria Math"/>
+                    <w:i/>
+                    <w:highlight w:val="yellow"/>
+                  </w:rPr>
+                </m:ctrlPr>
+              </m:sSubPr>
+              <m:e>
+                <m:r>
+                  <w:rPr>
+                    <w:rFonts w:ascii="Cambria Math" w:hAnsi="Cambria Math"/>
+                    <w:highlight w:val="yellow"/>
+                  </w:rPr>
+                  <m:t>δ</m:t>
+                </m:r>
+              </m:e>
+              <m:sub>
+                <m:r>
+                  <w:rPr>
+                    <w:rFonts w:ascii="Cambria Math" w:hAnsi="Cambria Math"/>
+                    <w:highlight w:val="yellow"/>
+                  </w:rPr>
+                  <m:t>n,k</m:t>
+                </m:r>
+              </m:sub>
+            </m:sSub>
+          </m:e>
+        </m:d>
+        <m:r>
+          <w:rPr>
+            <w:rFonts w:ascii="Cambria Math" w:hAnsi="Cambria Math"/>
+            <w:highlight w:val="yellow"/>
+          </w:rPr>
+          <m:t>+</m:t>
+        </m:r>
+        <m:d>
+          <m:dPr>
+            <m:begChr m:val="|"/>
+            <m:endChr m:val="|"/>
+            <m:ctrlPr>
+              <w:rPr>
+                <w:rFonts w:ascii="Cambria Math" w:hAnsi="Cambria Math"/>
+                <w:i/>
+                <w:highlight w:val="yellow"/>
+              </w:rPr>
+            </m:ctrlPr>
+          </m:dPr>
+          <m:e>
+            <m:r>
+              <w:rPr>
+                <w:rFonts w:ascii="Cambria Math" w:hAnsi="Cambria Math"/>
+                <w:highlight w:val="yellow"/>
+              </w:rPr>
+              <m:t>∆</m:t>
+            </m:r>
+            <m:sSub>
+              <m:sSubPr>
+                <m:ctrlPr>
+                  <w:rPr>
+                    <w:rFonts w:ascii="Cambria Math" w:hAnsi="Cambria Math"/>
+                    <w:i/>
+                    <w:highlight w:val="yellow"/>
+                  </w:rPr>
+                </m:ctrlPr>
+              </m:sSubPr>
+              <m:e>
+                <m:r>
+                  <w:rPr>
+                    <w:rFonts w:ascii="Cambria Math" w:hAnsi="Cambria Math"/>
+                    <w:highlight w:val="yellow"/>
+                  </w:rPr>
+                  <m:t>Γ</m:t>
+                </m:r>
+              </m:e>
+              <m:sub>
+                <m:r>
+                  <w:rPr>
+                    <w:rFonts w:ascii="Cambria Math" w:hAnsi="Cambria Math"/>
+                    <w:highlight w:val="yellow"/>
+                  </w:rPr>
+                  <m:t>k</m:t>
+                </m:r>
+              </m:sub>
+            </m:sSub>
+          </m:e>
+        </m:d>
+        <m:r>
+          <w:rPr>
+            <w:rFonts w:ascii="Cambria Math" w:hAnsi="Cambria Math"/>
+            <w:highlight w:val="yellow"/>
+          </w:rPr>
+          <m:t>≤</m:t>
+        </m:r>
+        <m:r>
+          <w:rPr>
+            <w:rFonts w:ascii="Cambria Math" w:hAnsi="Cambria Math"/>
+          </w:rPr>
+          <m:t>κ</m:t>
+        </m:r>
+        <m:f>
+          <m:fPr>
+            <m:ctrlPr>
+              <w:rPr>
+                <w:rFonts w:ascii="Cambria Math" w:hAnsi="Cambria Math"/>
+                <w:i/>
+              </w:rPr>
+            </m:ctrlPr>
+          </m:fPr>
+          <m:num>
+            <m:r>
+              <w:rPr>
+                <w:rFonts w:ascii="Cambria Math" w:hAnsi="Cambria Math"/>
+              </w:rPr>
+              <m:t>2s</m:t>
+            </m:r>
+            <m:d>
+              <m:dPr>
+                <m:ctrlPr>
+                  <w:rPr>
+                    <w:rFonts w:ascii="Cambria Math" w:hAnsi="Cambria Math"/>
+                    <w:i/>
+                  </w:rPr>
+                </m:ctrlPr>
+              </m:dPr>
+              <m:e>
+                <m:r>
+                  <w:rPr>
+                    <w:rFonts w:ascii="Cambria Math" w:hAnsi="Cambria Math"/>
+                  </w:rPr>
+                  <m:t>α</m:t>
+                </m:r>
+              </m:e>
+            </m:d>
+          </m:num>
+          <m:den>
+            <m:rad>
+              <m:radPr>
+                <m:degHide m:val="1"/>
+                <m:ctrlPr>
+                  <w:rPr>
+                    <w:rFonts w:ascii="Cambria Math" w:hAnsi="Cambria Math"/>
+                  </w:rPr>
+                </m:ctrlPr>
+              </m:radPr>
+              <m:deg/>
+              <m:e>
+                <m:r>
+                  <w:rPr>
+                    <w:rFonts w:ascii="Cambria Math" w:hAnsi="Cambria Math"/>
+                  </w:rPr>
+                  <m:t>n</m:t>
+                </m:r>
+              </m:e>
+            </m:rad>
+          </m:den>
+        </m:f>
+      </m:oMath>
+      <w:r>
+        <w:rPr>
+          <w:rFonts w:eastAsiaTheme="minorEastAsia"/>
+        </w:rPr>
+        <w:t xml:space="preserve">. </w:t>
+      </w:r>
+    </w:p>
+    <w:p>
+      <w:pPr>
+        <w:rPr>
+          <w:rFonts w:eastAsiaTheme="minorEastAsia"/>
+          <w:sz w:val="24"/>
+          <w:szCs w:val="24"/>
+        </w:rPr>
+      </w:pPr>
+      <w:r>
+        <w:rPr>
+          <w:rFonts w:ascii="Times New Roman" w:eastAsiaTheme="minorEastAsia" w:hAnsi="Times New Roman" w:cs="Times New Roman"/>
+          <w:sz w:val="24"/>
+          <w:szCs w:val="24"/>
+        </w:rPr>
+        <w:t xml:space="preserve">For </w:t>
+      </w:r>
+      <m:oMath>
+        <m:r>
+          <w:rPr>
+            <w:rFonts w:ascii="Cambria Math" w:hAnsi="Cambria Math"/>
+            <w:sz w:val="24"/>
+            <w:szCs w:val="24"/>
+          </w:rPr>
+          <m:t>0.5≤</m:t>
+        </m:r>
+        <m:r>
+          <m:rPr>
+            <m:scr m:val="script"/>
+          </m:rPr>
+          <w:rPr>
+            <w:rFonts w:ascii="Cambria Math" w:hAnsi="Cambria Math"/>
+            <w:sz w:val="24"/>
+            <w:szCs w:val="24"/>
+          </w:rPr>
+          <m:t>M&lt;</m:t>
+        </m:r>
+        <m:r>
+          <w:rPr>
+            <w:rFonts w:ascii="Cambria Math" w:hAnsi="Cambria Math"/>
+            <w:sz w:val="24"/>
+            <w:szCs w:val="24"/>
+          </w:rPr>
+          <m:t>1</m:t>
+        </m:r>
+      </m:oMath>
+      <w:r>
+        <w:rPr>
+          <w:rFonts w:eastAsiaTheme="minorEastAsia"/>
+          <w:sz w:val="24"/>
+          <w:szCs w:val="24"/>
+        </w:rPr>
+        <w:t>:</w:t>
+      </w:r>
+    </w:p>
+    <w:p>
+      <w:pPr>
+        <w:rPr>
+          <w:rFonts w:eastAsiaTheme="minorEastAsia"/>
+          <w:sz w:val="24"/>
+          <w:szCs w:val="24"/>
+        </w:rPr>
+      </w:pPr>
+      <m:oMathPara>
+        <m:oMath>
+          <m:d>
+            <m:dPr>
+              <m:begChr m:val="|"/>
+              <m:endChr m:val="|"/>
+              <m:ctrlPr>
+                <w:rPr>
+                  <w:rFonts w:ascii="Cambria Math" w:hAnsi="Cambria Math"/>
+                  <w:i/>
+                  <w:sz w:val="24"/>
+                  <w:szCs w:val="24"/>
+                </w:rPr>
+              </m:ctrlPr>
+            </m:dPr>
+            <m:e>
+              <m:r>
+                <w:rPr>
+                  <w:rFonts w:ascii="Cambria Math" w:hAnsi="Cambria Math"/>
+                  <w:sz w:val="24"/>
+                  <w:szCs w:val="24"/>
+                </w:rPr>
+                <m:t>μ</m:t>
+              </m:r>
+              <m:d>
+                <m:dPr>
+                  <m:ctrlPr>
+                    <w:rPr>
+                      <w:rFonts w:ascii="Cambria Math" w:hAnsi="Cambria Math"/>
+                      <w:i/>
+                      <w:sz w:val="24"/>
+                      <w:szCs w:val="24"/>
+                    </w:rPr>
+                  </m:ctrlPr>
+                </m:dPr>
+                <m:e>
+                  <m:sSub>
+                    <m:sSubPr>
+                      <m:ctrlPr>
+                        <w:rPr>
+                          <w:rFonts w:ascii="Cambria Math" w:hAnsi="Cambria Math"/>
+                          <w:i/>
+                          <w:sz w:val="24"/>
+                          <w:szCs w:val="24"/>
+                        </w:rPr>
+                      </m:ctrlPr>
+                    </m:sSubPr>
+                    <m:e>
+                      <m:r>
+                        <w:rPr>
+                          <w:rFonts w:ascii="Cambria Math" w:hAnsi="Cambria Math"/>
+                          <w:sz w:val="24"/>
+                          <w:szCs w:val="24"/>
+                        </w:rPr>
+                        <m:t>α</m:t>
+                      </m:r>
+                    </m:e>
+                    <m:sub>
+                      <m:r>
+                        <w:rPr>
+                          <w:rFonts w:ascii="Cambria Math" w:hAnsi="Cambria Math"/>
+                          <w:sz w:val="24"/>
+                          <w:szCs w:val="24"/>
+                        </w:rPr>
+                        <m:t>k</m:t>
+                      </m:r>
+                    </m:sub>
+                  </m:sSub>
+                </m:e>
+              </m:d>
+              <m:r>
+                <w:rPr>
+                  <w:rFonts w:ascii="Cambria Math" w:hAnsi="Cambria Math"/>
+                  <w:sz w:val="24"/>
+                  <w:szCs w:val="24"/>
+                </w:rPr>
+                <m:t>-</m:t>
+              </m:r>
+              <m:sSub>
+                <m:sSubPr>
+                  <m:ctrlPr>
+                    <w:rPr>
+                      <w:rFonts w:ascii="Cambria Math" w:hAnsi="Cambria Math"/>
+                      <w:i/>
+                      <w:sz w:val="24"/>
+                      <w:szCs w:val="24"/>
+                    </w:rPr>
+                  </m:ctrlPr>
+                </m:sSubPr>
+                <m:e>
+                  <m:r>
+                    <w:rPr>
+                      <w:rFonts w:ascii="Cambria Math" w:hAnsi="Cambria Math"/>
+                      <w:sz w:val="24"/>
+                      <w:szCs w:val="24"/>
+                    </w:rPr>
+                    <m:t>v</m:t>
+                  </m:r>
+                </m:e>
+                <m:sub>
+                  <m:r>
+                    <w:rPr>
+                      <w:rFonts w:ascii="Cambria Math" w:hAnsi="Cambria Math"/>
+                      <w:sz w:val="24"/>
+                      <w:szCs w:val="24"/>
+                    </w:rPr>
+                    <m:t>d</m:t>
+                  </m:r>
+                </m:sub>
+              </m:sSub>
+            </m:e>
+          </m:d>
+          <m:r>
+            <w:rPr>
+              <w:rFonts w:ascii="Cambria Math" w:hAnsi="Cambria Math"/>
+              <w:sz w:val="24"/>
+              <w:szCs w:val="24"/>
+            </w:rPr>
+            <m:t>≤</m:t>
+          </m:r>
+          <m:r>
+            <w:rPr>
+              <w:rFonts w:ascii="Cambria Math" w:hAnsi="Cambria Math"/>
+              <w:sz w:val="24"/>
+              <w:szCs w:val="24"/>
+            </w:rPr>
+            <m:t>κ</m:t>
+          </m:r>
+          <m:f>
+            <m:fPr>
+              <m:ctrlPr>
+                <w:rPr>
+                  <w:rFonts w:ascii="Cambria Math" w:hAnsi="Cambria Math"/>
+                  <w:i/>
+                  <w:sz w:val="24"/>
+                  <w:szCs w:val="24"/>
+                </w:rPr>
+              </m:ctrlPr>
+            </m:fPr>
+            <m:num>
+              <m:r>
+                <w:rPr>
+                  <w:rFonts w:ascii="Cambria Math" w:hAnsi="Cambria Math"/>
+                  <w:sz w:val="24"/>
+                  <w:szCs w:val="24"/>
+                </w:rPr>
+                <m:t>2s</m:t>
+              </m:r>
+              <m:d>
+                <m:dPr>
+                  <m:ctrlPr>
+                    <w:rPr>
+                      <w:rFonts w:ascii="Cambria Math" w:hAnsi="Cambria Math"/>
+                      <w:i/>
+                      <w:sz w:val="24"/>
+                      <w:szCs w:val="24"/>
+                    </w:rPr>
+                  </m:ctrlPr>
+                </m:dPr>
+                <m:e>
+                  <m:r>
+                    <w:rPr>
+                      <w:rFonts w:ascii="Cambria Math" w:hAnsi="Cambria Math"/>
+                      <w:sz w:val="24"/>
+                      <w:szCs w:val="24"/>
+                    </w:rPr>
+                    <m:t>α</m:t>
+                  </m:r>
+                </m:e>
+              </m:d>
+            </m:num>
+            <m:den>
+              <m:rad>
+                <m:radPr>
+                  <m:degHide m:val="1"/>
+                  <m:ctrlPr>
+                    <w:rPr>
+                      <w:rFonts w:ascii="Cambria Math" w:hAnsi="Cambria Math"/>
+                      <w:sz w:val="24"/>
+                      <w:szCs w:val="24"/>
+                    </w:rPr>
+                  </m:ctrlPr>
+                </m:radPr>
+                <m:deg/>
+                <m:e>
+                  <m:r>
+                    <w:rPr>
+                      <w:rFonts w:ascii="Cambria Math" w:hAnsi="Cambria Math"/>
+                      <w:sz w:val="24"/>
+                      <w:szCs w:val="24"/>
+                    </w:rPr>
+                    <m:t>n</m:t>
+                  </m:r>
+                </m:e>
+              </m:rad>
+            </m:den>
+          </m:f>
+          <m:r>
+            <w:rPr>
+              <w:rFonts w:ascii="Cambria Math" w:eastAsiaTheme="minorEastAsia" w:hAnsi="Cambria Math"/>
+              <w:sz w:val="24"/>
+              <w:szCs w:val="24"/>
+            </w:rPr>
+            <m:t>+</m:t>
+          </m:r>
+          <m:r>
+            <w:rPr>
+              <w:rFonts w:ascii="Cambria Math" w:hAnsi="Cambria Math"/>
+              <w:sz w:val="24"/>
+              <w:szCs w:val="24"/>
+            </w:rPr>
+            <m:t>κ</m:t>
+          </m:r>
+          <m:f>
+            <m:fPr>
+              <m:ctrlPr>
+                <w:rPr>
+                  <w:rFonts w:ascii="Cambria Math" w:hAnsi="Cambria Math"/>
+                  <w:i/>
+                  <w:sz w:val="24"/>
+                  <w:szCs w:val="24"/>
+                </w:rPr>
+              </m:ctrlPr>
+            </m:fPr>
+            <m:num>
+              <m:r>
+                <w:rPr>
+                  <w:rFonts w:ascii="Cambria Math" w:hAnsi="Cambria Math"/>
+                  <w:sz w:val="24"/>
+                  <w:szCs w:val="24"/>
+                </w:rPr>
+                <m:t>2s</m:t>
+              </m:r>
+              <m:d>
+                <m:dPr>
+                  <m:ctrlPr>
+                    <w:rPr>
+                      <w:rFonts w:ascii="Cambria Math" w:hAnsi="Cambria Math"/>
+                      <w:i/>
+                      <w:sz w:val="24"/>
+                      <w:szCs w:val="24"/>
+                    </w:rPr>
+                  </m:ctrlPr>
+                </m:dPr>
+                <m:e>
+                  <m:r>
+                    <w:rPr>
+                      <w:rFonts w:ascii="Cambria Math" w:hAnsi="Cambria Math"/>
+                      <w:sz w:val="24"/>
+                      <w:szCs w:val="24"/>
+                    </w:rPr>
+                    <m:t>α</m:t>
+                  </m:r>
+                </m:e>
+              </m:d>
+            </m:num>
+            <m:den>
+              <m:rad>
+                <m:radPr>
+                  <m:degHide m:val="1"/>
+                  <m:ctrlPr>
+                    <w:rPr>
+                      <w:rFonts w:ascii="Cambria Math" w:hAnsi="Cambria Math"/>
+                      <w:sz w:val="24"/>
+                      <w:szCs w:val="24"/>
+                    </w:rPr>
+                  </m:ctrlPr>
+                </m:radPr>
+                <m:deg/>
+                <m:e>
+                  <m:r>
+                    <w:rPr>
+                      <w:rFonts w:ascii="Cambria Math" w:hAnsi="Cambria Math"/>
+                      <w:sz w:val="24"/>
+                      <w:szCs w:val="24"/>
+                    </w:rPr>
+                    <m:t>n</m:t>
+                  </m:r>
+                </m:e>
+              </m:rad>
+            </m:den>
+          </m:f>
+        </m:oMath>
+      </m:oMathPara>
+    </w:p>
+    <w:p>
+      <w:pPr>
+        <w:rPr>
+          <w:rFonts w:eastAsiaTheme="minorEastAsia"/>
+          <w:sz w:val="24"/>
+          <w:szCs w:val="24"/>
+        </w:rPr>
+      </w:pPr>
+      <w:r>
+        <w:rPr>
+          <w:rFonts w:eastAsiaTheme="minorEastAsia"/>
+          <w:sz w:val="24"/>
+          <w:szCs w:val="24"/>
+        </w:rPr>
+        <w:t xml:space="preserve">For </w:t>
+      </w:r>
+      <m:oMath>
+        <m:r>
+          <w:rPr>
+            <w:rFonts w:ascii="Cambria Math" w:hAnsi="Cambria Math"/>
+            <w:sz w:val="24"/>
+            <w:szCs w:val="24"/>
+          </w:rPr>
+          <m:t>0&lt;</m:t>
+        </m:r>
+        <m:r>
+          <m:rPr>
+            <m:scr m:val="script"/>
+          </m:rPr>
+          <w:rPr>
+            <w:rFonts w:ascii="Cambria Math" w:hAnsi="Cambria Math"/>
+            <w:sz w:val="24"/>
+            <w:szCs w:val="24"/>
+          </w:rPr>
+          <m:t>M&lt;</m:t>
+        </m:r>
+        <m:r>
+          <w:rPr>
+            <w:rFonts w:ascii="Cambria Math" w:hAnsi="Cambria Math"/>
+            <w:sz w:val="24"/>
+            <w:szCs w:val="24"/>
+          </w:rPr>
+          <m:t>0.5</m:t>
+        </m:r>
+      </m:oMath>
+      <w:r>
+        <w:rPr>
+          <w:rFonts w:eastAsiaTheme="minorEastAsia"/>
+          <w:sz w:val="24"/>
+          <w:szCs w:val="24"/>
+        </w:rPr>
+        <w:t>:</w:t>
+      </w:r>
+    </w:p>
+    <w:p>
+      <w:pPr>
+        <w:rPr>
+          <w:rFonts w:eastAsiaTheme="minorEastAsia"/>
+          <w:sz w:val="24"/>
+          <w:szCs w:val="24"/>
+        </w:rPr>
+      </w:pPr>
+      <m:oMathPara>
+        <m:oMath>
+          <m:d>
+            <m:dPr>
+              <m:begChr m:val="|"/>
+              <m:endChr m:val="|"/>
+              <m:ctrlPr>
+                <w:rPr>
+                  <w:rFonts w:ascii="Cambria Math" w:hAnsi="Cambria Math"/>
+                  <w:i/>
+                  <w:sz w:val="24"/>
+                  <w:szCs w:val="24"/>
+                </w:rPr>
+              </m:ctrlPr>
+            </m:dPr>
+            <m:e>
+              <m:r>
+                <w:rPr>
+                  <w:rFonts w:ascii="Cambria Math" w:hAnsi="Cambria Math"/>
+                  <w:sz w:val="24"/>
+                  <w:szCs w:val="24"/>
+                </w:rPr>
+                <m:t>μ</m:t>
+              </m:r>
+              <m:d>
+                <m:dPr>
+                  <m:ctrlPr>
+                    <w:rPr>
+                      <w:rFonts w:ascii="Cambria Math" w:hAnsi="Cambria Math"/>
+                      <w:i/>
+                      <w:sz w:val="24"/>
+                      <w:szCs w:val="24"/>
+                    </w:rPr>
+                  </m:ctrlPr>
+                </m:dPr>
+                <m:e>
+                  <m:sSub>
+                    <m:sSubPr>
+                      <m:ctrlPr>
+                        <w:rPr>
+                          <w:rFonts w:ascii="Cambria Math" w:hAnsi="Cambria Math"/>
+                          <w:i/>
+                          <w:sz w:val="24"/>
+                          <w:szCs w:val="24"/>
+                        </w:rPr>
+                      </m:ctrlPr>
+                    </m:sSubPr>
+                    <m:e>
+                      <m:r>
+                        <w:rPr>
+                          <w:rFonts w:ascii="Cambria Math" w:hAnsi="Cambria Math"/>
+                          <w:sz w:val="24"/>
+                          <w:szCs w:val="24"/>
+                        </w:rPr>
+                        <m:t>α</m:t>
+                      </m:r>
+                    </m:e>
+                    <m:sub>
+                      <m:r>
+                        <w:rPr>
+                          <w:rFonts w:ascii="Cambria Math" w:hAnsi="Cambria Math"/>
+                          <w:sz w:val="24"/>
+                          <w:szCs w:val="24"/>
+                        </w:rPr>
+                        <m:t>k</m:t>
+                      </m:r>
+                    </m:sub>
+                  </m:sSub>
+                </m:e>
+              </m:d>
+              <m:r>
+                <w:rPr>
+                  <w:rFonts w:ascii="Cambria Math" w:hAnsi="Cambria Math"/>
+                  <w:sz w:val="24"/>
+                  <w:szCs w:val="24"/>
+                </w:rPr>
+                <m:t>-</m:t>
+              </m:r>
+              <m:sSub>
+                <m:sSubPr>
+                  <m:ctrlPr>
+                    <w:rPr>
+                      <w:rFonts w:ascii="Cambria Math" w:hAnsi="Cambria Math"/>
+                      <w:i/>
+                      <w:sz w:val="24"/>
+                      <w:szCs w:val="24"/>
+                    </w:rPr>
+                  </m:ctrlPr>
+                </m:sSubPr>
+                <m:e>
+                  <m:r>
+                    <w:rPr>
+                      <w:rFonts w:ascii="Cambria Math" w:hAnsi="Cambria Math"/>
+                      <w:sz w:val="24"/>
+                      <w:szCs w:val="24"/>
+                    </w:rPr>
+                    <m:t>v</m:t>
+                  </m:r>
+                </m:e>
+                <m:sub>
+                  <m:r>
+                    <w:rPr>
+                      <w:rFonts w:ascii="Cambria Math" w:hAnsi="Cambria Math"/>
+                      <w:sz w:val="24"/>
+                      <w:szCs w:val="24"/>
+                    </w:rPr>
+                    <m:t>d</m:t>
+                  </m:r>
+                </m:sub>
+              </m:sSub>
+            </m:e>
+          </m:d>
+          <m:r>
+            <w:rPr>
+              <w:rFonts w:ascii="Cambria Math" w:hAnsi="Cambria Math"/>
+              <w:sz w:val="24"/>
+              <w:szCs w:val="24"/>
+            </w:rPr>
+            <m:t>≤</m:t>
+          </m:r>
+          <m:r>
+            <w:rPr>
+              <w:rFonts w:ascii="Cambria Math" w:hAnsi="Cambria Math"/>
+              <w:sz w:val="24"/>
+              <w:szCs w:val="24"/>
+            </w:rPr>
+            <m:t>κ</m:t>
+          </m:r>
+          <m:f>
+            <m:fPr>
+              <m:ctrlPr>
+                <w:rPr>
+                  <w:rFonts w:ascii="Cambria Math" w:hAnsi="Cambria Math"/>
+                  <w:sz w:val="24"/>
+                  <w:szCs w:val="24"/>
+                </w:rPr>
+              </m:ctrlPr>
+            </m:fPr>
+            <m:num>
+              <m:d>
+                <m:dPr>
+                  <m:ctrlPr>
+                    <w:rPr>
+                      <w:rFonts w:ascii="Cambria Math" w:hAnsi="Cambria Math"/>
+                      <w:i/>
+                      <w:sz w:val="24"/>
+                      <w:szCs w:val="24"/>
+                    </w:rPr>
+                  </m:ctrlPr>
+                </m:dPr>
+                <m:e>
+                  <m:r>
+                    <w:rPr>
+                      <w:rFonts w:ascii="Cambria Math" w:hAnsi="Cambria Math"/>
+                      <w:sz w:val="24"/>
+                      <w:szCs w:val="24"/>
+                    </w:rPr>
+                    <m:t>1-</m:t>
+                  </m:r>
+                  <m:r>
+                    <m:rPr>
+                      <m:scr m:val="script"/>
+                    </m:rPr>
+                    <w:rPr>
+                      <w:rFonts w:ascii="Cambria Math" w:hAnsi="Cambria Math"/>
+                      <w:sz w:val="24"/>
+                      <w:szCs w:val="24"/>
+                    </w:rPr>
+                    <m:t>M</m:t>
+                  </m:r>
+                </m:e>
+              </m:d>
+              <m:ctrlPr>
+                <w:rPr>
+                  <w:rFonts w:ascii="Cambria Math" w:hAnsi="Cambria Math"/>
+                  <w:i/>
+                  <w:sz w:val="24"/>
+                  <w:szCs w:val="24"/>
+                </w:rPr>
+              </m:ctrlPr>
+            </m:num>
+            <m:den>
+              <m:r>
+                <m:rPr>
+                  <m:scr m:val="script"/>
+                </m:rPr>
+                <w:rPr>
+                  <w:rFonts w:ascii="Cambria Math" w:hAnsi="Cambria Math"/>
+                  <w:sz w:val="24"/>
+                  <w:szCs w:val="24"/>
+                </w:rPr>
+                <m:t>M</m:t>
+              </m:r>
+              <m:ctrlPr>
+                <w:rPr>
+                  <w:rFonts w:ascii="Cambria Math" w:hAnsi="Cambria Math"/>
+                  <w:i/>
+                  <w:sz w:val="24"/>
+                  <w:szCs w:val="24"/>
+                </w:rPr>
+              </m:ctrlPr>
+            </m:den>
+          </m:f>
+          <m:f>
+            <m:fPr>
+              <m:ctrlPr>
+                <w:rPr>
+                  <w:rFonts w:ascii="Cambria Math" w:hAnsi="Cambria Math"/>
+                  <w:i/>
+                  <w:sz w:val="24"/>
+                  <w:szCs w:val="24"/>
+                </w:rPr>
+              </m:ctrlPr>
+            </m:fPr>
+            <m:num>
+              <m:r>
+                <w:rPr>
+                  <w:rFonts w:ascii="Cambria Math" w:hAnsi="Cambria Math"/>
+                  <w:sz w:val="24"/>
+                  <w:szCs w:val="24"/>
+                </w:rPr>
+                <m:t>2s</m:t>
+              </m:r>
+              <m:d>
+                <m:dPr>
+                  <m:ctrlPr>
+                    <w:rPr>
+                      <w:rFonts w:ascii="Cambria Math" w:hAnsi="Cambria Math"/>
+                      <w:i/>
+                      <w:sz w:val="24"/>
+                      <w:szCs w:val="24"/>
+                    </w:rPr>
+                  </m:ctrlPr>
+                </m:dPr>
+                <m:e>
+                  <m:r>
+                    <w:rPr>
+                      <w:rFonts w:ascii="Cambria Math" w:hAnsi="Cambria Math"/>
+                      <w:sz w:val="24"/>
+                      <w:szCs w:val="24"/>
+                    </w:rPr>
+                    <m:t>α</m:t>
+                  </m:r>
+                </m:e>
+              </m:d>
+            </m:num>
+            <m:den>
+              <m:rad>
+                <m:radPr>
+                  <m:degHide m:val="1"/>
+                  <m:ctrlPr>
+                    <w:rPr>
+                      <w:rFonts w:ascii="Cambria Math" w:hAnsi="Cambria Math"/>
+                      <w:sz w:val="24"/>
+                      <w:szCs w:val="24"/>
+                    </w:rPr>
+                  </m:ctrlPr>
+                </m:radPr>
+                <m:deg/>
+                <m:e>
+                  <m:r>
+                    <w:rPr>
+                      <w:rFonts w:ascii="Cambria Math" w:hAnsi="Cambria Math"/>
+                      <w:sz w:val="24"/>
+                      <w:szCs w:val="24"/>
+                    </w:rPr>
+                    <m:t>n</m:t>
+                  </m:r>
+                </m:e>
+              </m:rad>
+            </m:den>
+          </m:f>
+          <m:r>
+            <w:rPr>
+              <w:rFonts w:ascii="Cambria Math" w:eastAsiaTheme="minorEastAsia" w:hAnsi="Cambria Math"/>
+              <w:sz w:val="24"/>
+              <w:szCs w:val="24"/>
+            </w:rPr>
+            <m:t>+</m:t>
+          </m:r>
+          <m:r>
+            <w:rPr>
+              <w:rFonts w:ascii="Cambria Math" w:hAnsi="Cambria Math"/>
+              <w:sz w:val="24"/>
+              <w:szCs w:val="24"/>
+            </w:rPr>
+            <m:t>κ</m:t>
+          </m:r>
+          <m:f>
+            <m:fPr>
+              <m:ctrlPr>
+                <w:rPr>
+                  <w:rFonts w:ascii="Cambria Math" w:hAnsi="Cambria Math"/>
+                  <w:i/>
+                  <w:sz w:val="24"/>
+                  <w:szCs w:val="24"/>
+                </w:rPr>
+              </m:ctrlPr>
+            </m:fPr>
+            <m:num>
+              <m:r>
+                <w:rPr>
+                  <w:rFonts w:ascii="Cambria Math" w:hAnsi="Cambria Math"/>
+                  <w:sz w:val="24"/>
+                  <w:szCs w:val="24"/>
+                </w:rPr>
+                <m:t>2s</m:t>
+              </m:r>
+              <m:d>
+                <m:dPr>
+                  <m:ctrlPr>
+                    <w:rPr>
+                      <w:rFonts w:ascii="Cambria Math" w:hAnsi="Cambria Math"/>
+                      <w:i/>
+                      <w:sz w:val="24"/>
+                      <w:szCs w:val="24"/>
+                    </w:rPr>
+                  </m:ctrlPr>
+                </m:dPr>
+                <m:e>
+                  <m:r>
+                    <w:rPr>
+                      <w:rFonts w:ascii="Cambria Math" w:hAnsi="Cambria Math"/>
+                      <w:sz w:val="24"/>
+                      <w:szCs w:val="24"/>
+                    </w:rPr>
+                    <m:t>α</m:t>
+                  </m:r>
+                </m:e>
+              </m:d>
+            </m:num>
+            <m:den>
+              <m:rad>
+                <m:radPr>
+                  <m:degHide m:val="1"/>
+                  <m:ctrlPr>
+                    <w:rPr>
+                      <w:rFonts w:ascii="Cambria Math" w:hAnsi="Cambria Math"/>
+                      <w:sz w:val="24"/>
+                      <w:szCs w:val="24"/>
+                    </w:rPr>
+                  </m:ctrlPr>
+                </m:radPr>
+                <m:deg/>
+                <m:e>
+                  <m:r>
+                    <w:rPr>
+                      <w:rFonts w:ascii="Cambria Math" w:hAnsi="Cambria Math"/>
+                      <w:sz w:val="24"/>
+                      <w:szCs w:val="24"/>
+                    </w:rPr>
+                    <m:t>n</m:t>
+                  </m:r>
+                </m:e>
+              </m:rad>
+            </m:den>
+          </m:f>
+        </m:oMath>
+      </m:oMathPara>
+    </w:p>
+    <w:p>
+      <w:pPr>
+        <w:rPr>
+          <w:rFonts w:eastAsiaTheme="minorEastAsia"/>
+          <w:sz w:val="24"/>
+          <w:szCs w:val="24"/>
+        </w:rPr>
+      </w:pPr>
+      <w:r>
+        <w:rPr>
+          <w:rFonts w:eastAsiaTheme="minorEastAsia"/>
+          <w:sz w:val="24"/>
+          <w:szCs w:val="24"/>
+        </w:rPr>
+        <w:t xml:space="preserve">A conservative </w:t>
+      </w:r>
+      <w:r>
+        <w:rPr>
+          <w:rFonts w:eastAsiaTheme="minorEastAsia"/>
+          <w:sz w:val="24"/>
+          <w:szCs w:val="24"/>
+        </w:rPr>
+        <w:t xml:space="preserve">constant for the noise bounded region maximum cap </w:t>
+      </w:r>
+      <w:r>
+        <w:rPr>
+          <w:rFonts w:eastAsiaTheme="minorEastAsia"/>
+          <w:sz w:val="24"/>
+          <w:szCs w:val="24"/>
+        </w:rPr>
+        <w:t>is</w:t>
+      </w:r>
+      <w:r>
+        <w:rPr>
+          <w:rFonts w:eastAsiaTheme="minorEastAsia"/>
           <w:sz w:val="24"/>
           <w:szCs w:val="24"/>
         </w:rPr>
@@ -10804,6 +12093,22 @@
                   </m:ctrlPr>
                 </m:eqArrPr>
                 <m:e>
+                  <m:r>
+                    <w:rPr>
+                      <w:rFonts w:ascii="Cambria Math" w:hAnsi="Cambria Math"/>
+                      <w:sz w:val="24"/>
+                      <w:szCs w:val="24"/>
+                    </w:rPr>
+                    <m:t>2</m:t>
+                  </m:r>
+                  <m:r>
+                    <w:rPr>
+                      <w:rFonts w:ascii="Cambria Math" w:hAnsi="Cambria Math"/>
+                      <w:sz w:val="24"/>
+                      <w:szCs w:val="24"/>
+                    </w:rPr>
+                    <m:t>κ</m:t>
+                  </m:r>
                   <m:m>
                     <m:mPr>
                       <m:mcs>
@@ -10825,66 +12130,6 @@
                     </m:mPr>
                     <m:mr>
                       <m:e>
-                        <m:d>
-                          <m:dPr>
-                            <m:begChr m:val="|"/>
-                            <m:endChr m:val="|"/>
-                            <m:ctrlPr>
-                              <w:rPr>
-                                <w:rFonts w:ascii="Cambria Math" w:eastAsia="Times New Roman" w:hAnsi="Cambria Math" w:cs="Times New Roman"/>
-                                <w:i/>
-                                <w:kern w:val="0"/>
-                                <w:sz w:val="24"/>
-                                <w:szCs w:val="24"/>
-                                <w:lang w:val="en-US"/>
-                                <w14:ligatures w14:val="none"/>
-                              </w:rPr>
-                            </m:ctrlPr>
-                          </m:dPr>
-                          <m:e>
-                            <m:sSub>
-                              <m:sSubPr>
-                                <m:ctrlPr>
-                                  <w:rPr>
-                                    <w:rFonts w:ascii="Cambria Math" w:eastAsia="Times New Roman" w:hAnsi="Cambria Math" w:cs="Times New Roman"/>
-                                    <w:i/>
-                                    <w:kern w:val="0"/>
-                                    <w:sz w:val="24"/>
-                                    <w:szCs w:val="24"/>
-                                    <w:lang w:val="en-US"/>
-                                    <w14:ligatures w14:val="none"/>
-                                  </w:rPr>
-                                </m:ctrlPr>
-                              </m:sSubPr>
-                              <m:e>
-                                <m:r>
-                                  <w:rPr>
-                                    <w:rFonts w:ascii="Cambria Math" w:hAnsi="Cambria Math"/>
-                                    <w:sz w:val="24"/>
-                                    <w:szCs w:val="24"/>
-                                  </w:rPr>
-                                  <m:t>m</m:t>
-                                </m:r>
-                              </m:e>
-                              <m:sub>
-                                <m:r>
-                                  <w:rPr>
-                                    <w:rFonts w:ascii="Cambria Math" w:hAnsi="Cambria Math"/>
-                                    <w:sz w:val="24"/>
-                                    <w:szCs w:val="24"/>
-                                  </w:rPr>
-                                  <m:t>k</m:t>
-                                </m:r>
-                              </m:sub>
-                            </m:sSub>
-                          </m:e>
-                        </m:d>
-                        <m:r>
-                          <w:rPr>
-                            <w:rFonts w:ascii="Cambria Math" w:hAnsi="Cambria Math"/>
-                          </w:rPr>
-                          <m:t>+2</m:t>
-                        </m:r>
                         <m:r>
                           <w:rPr>
                             <w:rFonts w:ascii="Cambria Math" w:hAnsi="Cambria Math"/>
@@ -10948,60 +12193,6 @@
                     </m:mPr>
                     <m:mr>
                       <m:e>
-                        <m:d>
-                          <m:dPr>
-                            <m:begChr m:val="|"/>
-                            <m:endChr m:val="|"/>
-                            <m:ctrlPr>
-                              <w:rPr>
-                                <w:rFonts w:ascii="Cambria Math" w:eastAsia="Times New Roman" w:hAnsi="Cambria Math" w:cs="Times New Roman"/>
-                                <w:i/>
-                                <w:kern w:val="0"/>
-                                <w:sz w:val="24"/>
-                                <w:szCs w:val="24"/>
-                                <w:lang w:val="en-US"/>
-                                <w14:ligatures w14:val="none"/>
-                              </w:rPr>
-                            </m:ctrlPr>
-                          </m:dPr>
-                          <m:e>
-                            <m:sSub>
-                              <m:sSubPr>
-                                <m:ctrlPr>
-                                  <w:rPr>
-                                    <w:rFonts w:ascii="Cambria Math" w:eastAsia="Times New Roman" w:hAnsi="Cambria Math" w:cs="Times New Roman"/>
-                                    <w:i/>
-                                    <w:kern w:val="0"/>
-                                    <w:sz w:val="24"/>
-                                    <w:szCs w:val="24"/>
-                                    <w:lang w:val="en-US"/>
-                                    <w14:ligatures w14:val="none"/>
-                                  </w:rPr>
-                                </m:ctrlPr>
-                              </m:sSubPr>
-                              <m:e>
-                                <m:r>
-                                  <w:rPr>
-                                    <w:rFonts w:ascii="Cambria Math" w:hAnsi="Cambria Math"/>
-                                    <w:sz w:val="24"/>
-                                    <w:szCs w:val="24"/>
-                                  </w:rPr>
-                                  <m:t>m</m:t>
-                                </m:r>
-                              </m:e>
-                              <m:sub>
-                                <m:r>
-                                  <w:rPr>
-                                    <w:rFonts w:ascii="Cambria Math" w:hAnsi="Cambria Math"/>
-                                    <w:sz w:val="24"/>
-                                    <w:szCs w:val="24"/>
-                                  </w:rPr>
-                                  <m:t>k</m:t>
-                                </m:r>
-                              </m:sub>
-                            </m:sSub>
-                          </m:e>
-                        </m:d>
                         <m:f>
                           <m:fPr>
                             <m:ctrlPr>
@@ -11013,39 +12204,14 @@
                             </m:ctrlPr>
                           </m:fPr>
                           <m:num>
-                            <m:d>
-                              <m:dPr>
-                                <m:ctrlPr>
-                                  <w:rPr>
-                                    <w:rFonts w:ascii="Cambria Math" w:hAnsi="Cambria Math"/>
-                                    <w:i/>
-                                    <w:sz w:val="24"/>
-                                    <w:szCs w:val="24"/>
-                                  </w:rPr>
-                                </m:ctrlPr>
-                              </m:dPr>
-                              <m:e>
-                                <m:r>
-                                  <w:rPr>
-                                    <w:rFonts w:ascii="Cambria Math" w:hAnsi="Cambria Math"/>
-                                    <w:sz w:val="24"/>
-                                    <w:szCs w:val="24"/>
-                                  </w:rPr>
-                                  <m:t>1-</m:t>
-                                </m:r>
-                                <m:r>
-                                  <m:rPr>
-                                    <m:scr m:val="script"/>
-                                  </m:rPr>
-                                  <w:rPr>
-                                    <w:rFonts w:ascii="Cambria Math" w:hAnsi="Cambria Math"/>
-                                    <w:sz w:val="24"/>
-                                    <w:szCs w:val="24"/>
-                                  </w:rPr>
-                                  <m:t>M</m:t>
-                                </m:r>
-                              </m:e>
-                            </m:d>
+                            <m:r>
+                              <w:rPr>
+                                <w:rFonts w:ascii="Cambria Math" w:hAnsi="Cambria Math"/>
+                                <w:sz w:val="24"/>
+                                <w:szCs w:val="24"/>
+                              </w:rPr>
+                              <m:t>κ</m:t>
+                            </m:r>
                             <m:ctrlPr>
                               <w:rPr>
                                 <w:rFonts w:ascii="Cambria Math" w:hAnsi="Cambria Math"/>
@@ -11077,12 +12243,6 @@
                             </m:ctrlPr>
                           </m:den>
                         </m:f>
-                        <m:r>
-                          <w:rPr>
-                            <w:rFonts w:ascii="Cambria Math" w:hAnsi="Cambria Math"/>
-                          </w:rPr>
-                          <m:t>+2</m:t>
-                        </m:r>
                         <m:r>
                           <w:rPr>
                             <w:rFonts w:ascii="Cambria Math" w:hAnsi="Cambria Math"/>
@@ -11772,6 +12932,7 @@
   <w:style w:type="character" w:default="1" w:styleId="DefaultParagraphFont">
     <w:name w:val="Default Paragraph Font"/>
     <w:uiPriority w:val="1"/>
+    <w:semiHidden/>
     <w:unhideWhenUsed/>
   </w:style>
   <w:style w:type="table" w:default="1" w:styleId="TableNormal">

</xml_diff>